<commit_message>
Align unit notes with game rules and regenerate unit cards
Seventeen unit notes described rules the engine does not apply
(logistic points, hospital ship immune to attack, shuttle tankers
refuelling only tankers, landing only via Fearless/Intrepid, one Vulcan
sortie per turn, Exocet battery without reload, new minefields). They
now give the historical context and state what holds in the game. The
Invincible note no longer claims more resilience than the Hermes.

- gen_unit_cards.js reads fuel from the engine instead of a stale copy
  and omits the range for mines; all 72 cards regenerated with current
  values (14 units previously had no card).
- UNIT_CARD in client.js now maps every unit.
- Confidential annexes regenerated with the new notes.

Co-Authored-By: Claude Opus 5.5 <noreply@anthropic.com>
Claude-Session: https://claude.ai/code/session_017p7A6UppZTieAzjbFB3EvG
</commit_message>
<xml_diff>
--- a/docs/Anexo_Forca_Azul_Argentina.docx
+++ b/docs/Anexo_Forca_Azul_Argentina.docx
@@ -165,7 +165,7 @@
         <w:t xml:space="preserve">Notas</w:t>
       </w:r>
       <w:r>
-        <w:t xml:space="preserve"> traz o contexto histórico de cada unidade; quando uma nota descreve um procedimento que o jogo digital não simula, vale o que está na seção </w:t>
+        <w:t xml:space="preserve"> traz o contexto histórico de cada unidade e, quando a regra do jogo difere do que aconteceu em 1982, indica o que vale no jogo — detalhado na seção </w:t>
       </w:r>
       <w:r>
         <w:rPr>
@@ -3500,7 +3500,7 @@
                 <w:sz w:val="13"/>
                 <w:szCs w:val="13"/>
               </w:rPr>
-              <w:t xml:space="preserve">Grupos M1/M2. M1 inicia atracado em Río Gallegos e M2 nas imediações do porto, conforme o caderno. Cada um pode lançar um campo minado adicional (turnos 3 e 4 no jogo original).</w:t>
+              <w:t xml:space="preserve">Grupos M1/M2, baseados em Río Gallegos. Carregam 2 cargas de minas — um navio inimigo que entre no seu hex é atingido — e são a única unidade argentina capaz de varrer campos minados britânicos.</w:t>
             </w:r>
           </w:p>
         </w:tc>
@@ -4364,7 +4364,7 @@
                 <w:sz w:val="13"/>
                 <w:szCs w:val="13"/>
               </w:rPr>
-              <w:t xml:space="preserve">Formosa/Río Carcarañá, Río Cincel/Mar del Norte, Lago Argentino/Puerto Rosales. 4 LP por navio; atracados em Río Gallegos no início.</w:t>
+              <w:t xml:space="preserve">Formosa/Río Carcarañá, Río Cincel/Mar del Norte, Lago Argentino/Puerto Rosales. Atracados em Río Gallegos no início; reabastecem de combustível os navios que terminam o período no mesmo hex.</w:t>
             </w:r>
           </w:p>
         </w:tc>
@@ -6786,7 +6786,7 @@
                 <w:sz w:val="13"/>
                 <w:szCs w:val="13"/>
               </w:rPr>
-              <w:t xml:space="preserve">2ª Esquadrilha Aeronaval de Caça e Ataque, Río Grande. 5× AM39 Exocet disponíveis em toda a guerra, sem reposição (o caderno original cita 4).</w:t>
+              <w:t xml:space="preserve">2ª Esquadrilha Aeronaval de Caça e Ataque, Río Grande. Historicamente, só 5 AM39 Exocet em toda a guerra, sem reposição (o caderno original cita 4); no jogo, os mísseis são recompletados quando a esquadrilha volta à base.</w:t>
             </w:r>
           </w:p>
         </w:tc>
@@ -8226,7 +8226,7 @@
                 <w:sz w:val="13"/>
                 <w:szCs w:val="13"/>
               </w:rPr>
-              <w:t xml:space="preserve">2× KC-130H do Grupo 1 de Transporte Aéreo. Reabastecimento em voo de A-4 e Super Étendard — sem eles, os ataques continentais perdem tempo útil sobre o alvo.</w:t>
+              <w:t xml:space="preserve">2× KC-130H do Grupo 1 de Transporte Aéreo. Aeronave pronta que começa o período no mesmo hex recebe +50% de combustível — sem ele, os ataques a partir do continente têm pouco tempo sobre o alvo.</w:t>
             </w:r>
           </w:p>
         </w:tc>
@@ -9149,7 +9149,7 @@
                 <w:sz w:val="13"/>
                 <w:szCs w:val="13"/>
               </w:rPr>
-              <w:t xml:space="preserve">10ª Brigada de Infantería (3º, 6º, 7º, 25º RI) + 5º Batalhão de Infantaria de Marinha. ~5.000 efetivos. Consome 1 LP por turno; a zero, perde um dado de capacidade por turno.</w:t>
+              <w:t xml:space="preserve">10ª Brigada de Infantería (3º, 6º, 7º, 25º RI) + 5º Batalhão de Infantaria de Marinha. ~5.000 efetivos. Principal alvo da campanha terrestre britânica.</w:t>
             </w:r>
           </w:p>
         </w:tc>
@@ -9437,7 +9437,7 @@
                 <w:sz w:val="13"/>
                 <w:szCs w:val="13"/>
               </w:rPr>
-              <w:t xml:space="preserve">2× lançadores MM38 Exocet improvisados por técnicos navais. Atingiu o HMS Glamorgan em 12 jun 1982 — sem reabastecimento possível.</w:t>
+              <w:t xml:space="preserve">2× lançadores MM38 Exocet improvisados por técnicos navais. Atingiu o HMS Glamorgan em 12 jun 1982. No jogo, como unidade terrestre, volta a ter seus 2 mísseis a cada período.</w:t>
             </w:r>
           </w:p>
         </w:tc>
@@ -11741,7 +11741,7 @@
                 <w:sz w:val="13"/>
                 <w:szCs w:val="13"/>
               </w:rPr>
-              <w:t xml:space="preserve">Hub logístico continental. Reabastece navios argentinos em operação.</w:t>
+              <w:t xml:space="preserve">Hub logístico continental. Reabastece de combustível os navios no mesmo hex e recompleta a munição de navios e submarinos que passam o período parados no porto.</w:t>
             </w:r>
           </w:p>
         </w:tc>
@@ -12936,7 +12936,7 @@
         <w:t xml:space="preserve">Pontos Logísticos (LP)</w:t>
       </w:r>
       <w:r>
-        <w:t xml:space="preserve"> — as notas citam LP fornecidos pelos cargueiros e consumidos pela guarnição de Porto Argentino. É uma referência do jogo de tabuleiro original: o jogo digital não simula LP, e as guarnições não perdem capacidade por falta de suprimento.</w:t>
+        <w:t xml:space="preserve"> — o jogo de tabuleiro original usava LP para o suprimento das guarnições. O jogo digital não simula LP: as guarnições não perdem capacidade por falta de suprimento.</w:t>
       </w:r>
     </w:p>
     <w:p>

</xml_diff>